<commit_message>
Corrige MAPA-ORG v1.1 — substitui titulares na Seção 5 / aba Titular x Evidência pela equipe da proposta de entrevistas
Reverte a alteração indevida de RACI da versão anterior e aplica apenas a
substituição de titulares na Seção 5 (docx) / aba Titular x Evidência (xlsx),
conforme a proposta de papéis para entrevistas MPS-SW Nível C (equipe
principal + apoio opcional). Coluna de evidência mantida intacta; RACI,
competências e rastreabilidade sem alteração.

https://claude.ai/code/session_016t8bKHqvLbMdZ5bLTCngAs
</commit_message>
<xml_diff>
--- a/MAPA-ORG-001_Matriz-de-Papeis-e-Responsabilidades_v1.1.docx
+++ b/MAPA-ORG-001_Matriz-de-Papeis-e-Responsabilidades_v1.1.docx
@@ -1173,7 +1173,13 @@
               <w:spacing w:before="40" w:after="40"/>
             </w:pPr>
             <w:r>
-              <w:t>Gerente de Projeto</w:t>
+              <w:rPr>
+                <w:rFonts w:ascii="Calibri" w:hAnsi="Calibri"/>
+                <w:b w:val="0"/>
+                <w:i w:val="0"/>
+                <w:sz w:val="20"/>
+              </w:rPr>
+              <w:t>Time de Melhoria Contínua</w:t>
             </w:r>
           </w:p>
         </w:tc>
@@ -1219,7 +1225,13 @@
               <w:spacing w:before="40" w:after="40"/>
             </w:pPr>
             <w:r>
-              <w:t>SEPG (C); COO (I)</w:t>
+              <w:rPr>
+                <w:rFonts w:ascii="Calibri" w:hAnsi="Calibri"/>
+                <w:b w:val="0"/>
+                <w:i w:val="0"/>
+                <w:sz w:val="20"/>
+              </w:rPr>
+              <w:t>GQA (C); COO (I)</w:t>
             </w:r>
           </w:p>
         </w:tc>
@@ -1277,7 +1289,13 @@
               <w:spacing w:before="40" w:after="40"/>
             </w:pPr>
             <w:r>
-              <w:t>Gerente de Projeto / PO</w:t>
+              <w:rPr>
+                <w:rFonts w:ascii="Calibri" w:hAnsi="Calibri"/>
+                <w:b w:val="0"/>
+                <w:i w:val="0"/>
+                <w:sz w:val="20"/>
+              </w:rPr>
+              <w:t>Time de Melhoria Contínua</w:t>
             </w:r>
           </w:p>
         </w:tc>
@@ -1321,7 +1339,13 @@
               <w:spacing w:before="40" w:after="40"/>
             </w:pPr>
             <w:r>
-              <w:t>SEPG (C); Cliente (C)</w:t>
+              <w:rPr>
+                <w:rFonts w:ascii="Calibri" w:hAnsi="Calibri"/>
+                <w:b w:val="0"/>
+                <w:i w:val="0"/>
+                <w:sz w:val="20"/>
+              </w:rPr>
+              <w:t>GQA (C); Cliente (C)</w:t>
             </w:r>
           </w:p>
         </w:tc>
@@ -1381,7 +1405,13 @@
               <w:spacing w:before="40" w:after="40"/>
             </w:pPr>
             <w:r>
-              <w:t>Tech Lead</w:t>
+              <w:rPr>
+                <w:rFonts w:ascii="Calibri" w:hAnsi="Calibri"/>
+                <w:b w:val="0"/>
+                <w:i w:val="0"/>
+                <w:sz w:val="20"/>
+              </w:rPr>
+              <w:t>Time de Melhoria Contínua</w:t>
             </w:r>
           </w:p>
         </w:tc>
@@ -1427,6 +1457,12 @@
               <w:spacing w:before="40" w:after="40"/>
             </w:pPr>
             <w:r>
+              <w:rPr>
+                <w:rFonts w:ascii="Calibri" w:hAnsi="Calibri"/>
+                <w:b w:val="0"/>
+                <w:i w:val="0"/>
+                <w:sz w:val="20"/>
+              </w:rPr>
               <w:t>GQA (C); QA (C)</w:t>
             </w:r>
           </w:p>
@@ -1485,7 +1521,13 @@
               <w:spacing w:before="40" w:after="40"/>
             </w:pPr>
             <w:r>
-              <w:t>Tech Lead</w:t>
+              <w:rPr>
+                <w:rFonts w:ascii="Calibri" w:hAnsi="Calibri"/>
+                <w:b w:val="0"/>
+                <w:i w:val="0"/>
+                <w:sz w:val="20"/>
+              </w:rPr>
+              <w:t>Time de Melhoria Contínua</w:t>
             </w:r>
           </w:p>
         </w:tc>
@@ -1529,6 +1571,12 @@
               <w:spacing w:before="40" w:after="40"/>
             </w:pPr>
             <w:r>
+              <w:rPr>
+                <w:rFonts w:ascii="Calibri" w:hAnsi="Calibri"/>
+                <w:b w:val="0"/>
+                <w:i w:val="0"/>
+                <w:sz w:val="20"/>
+              </w:rPr>
               <w:t>QA (C); GQA (C)</w:t>
             </w:r>
           </w:p>
@@ -1589,7 +1637,13 @@
               <w:spacing w:before="40" w:after="40"/>
             </w:pPr>
             <w:r>
-              <w:t>QA</w:t>
+              <w:rPr>
+                <w:rFonts w:ascii="Calibri" w:hAnsi="Calibri"/>
+                <w:b w:val="0"/>
+                <w:i w:val="0"/>
+                <w:sz w:val="20"/>
+              </w:rPr>
+              <w:t>Time de Melhoria Contínua</w:t>
             </w:r>
           </w:p>
         </w:tc>
@@ -1635,7 +1689,13 @@
               <w:spacing w:before="40" w:after="40"/>
             </w:pPr>
             <w:r>
-              <w:t>Gerente de Projeto (C); Cliente (C)</w:t>
+              <w:rPr>
+                <w:rFonts w:ascii="Calibri" w:hAnsi="Calibri"/>
+                <w:b w:val="0"/>
+                <w:i w:val="0"/>
+                <w:sz w:val="20"/>
+              </w:rPr>
+              <w:t>GQA (C); Cliente (C)</w:t>
             </w:r>
           </w:p>
         </w:tc>
@@ -1693,7 +1753,13 @@
               <w:spacing w:before="40" w:after="40"/>
             </w:pPr>
             <w:r>
-              <w:t>Tech Lead</w:t>
+              <w:rPr>
+                <w:rFonts w:ascii="Calibri" w:hAnsi="Calibri"/>
+                <w:b w:val="0"/>
+                <w:i w:val="0"/>
+                <w:sz w:val="20"/>
+              </w:rPr>
+              <w:t>Time de Melhoria Contínua</w:t>
             </w:r>
           </w:p>
         </w:tc>
@@ -1737,7 +1803,13 @@
               <w:spacing w:before="40" w:after="40"/>
             </w:pPr>
             <w:r>
-              <w:t>GQA (C); DevOps (C)</w:t>
+              <w:rPr>
+                <w:rFonts w:ascii="Calibri" w:hAnsi="Calibri"/>
+                <w:b w:val="0"/>
+                <w:i w:val="0"/>
+                <w:sz w:val="20"/>
+              </w:rPr>
+              <w:t>GQA (C)</w:t>
             </w:r>
           </w:p>
         </w:tc>
@@ -1797,7 +1869,13 @@
               <w:spacing w:before="40" w:after="40"/>
             </w:pPr>
             <w:r>
-              <w:t>Time de Melhoria Contínua / SEPG</w:t>
+              <w:rPr>
+                <w:rFonts w:ascii="Calibri" w:hAnsi="Calibri"/>
+                <w:b w:val="0"/>
+                <w:i w:val="0"/>
+                <w:sz w:val="20"/>
+              </w:rPr>
+              <w:t>COO</w:t>
             </w:r>
           </w:p>
         </w:tc>
@@ -1843,7 +1921,13 @@
               <w:spacing w:before="40" w:after="40"/>
             </w:pPr>
             <w:r>
-              <w:t>RH / Capacitação (C); Sponsor / Portfólio (I)</w:t>
+              <w:rPr>
+                <w:rFonts w:ascii="Calibri" w:hAnsi="Calibri"/>
+                <w:b w:val="0"/>
+                <w:i w:val="0"/>
+                <w:sz w:val="20"/>
+              </w:rPr>
+              <w:t>COO (A)</w:t>
             </w:r>
           </w:p>
         </w:tc>
@@ -1901,7 +1985,13 @@
               <w:spacing w:before="40" w:after="40"/>
             </w:pPr>
             <w:r>
-              <w:t>Time de Melhoria Contínua / SEPG</w:t>
+              <w:rPr>
+                <w:rFonts w:ascii="Calibri" w:hAnsi="Calibri"/>
+                <w:b w:val="0"/>
+                <w:i w:val="0"/>
+                <w:sz w:val="20"/>
+              </w:rPr>
+              <w:t>Time de Melhoria Contínua</w:t>
             </w:r>
           </w:p>
         </w:tc>
@@ -1945,7 +2035,13 @@
               <w:spacing w:before="40" w:after="40"/>
             </w:pPr>
             <w:r>
-              <w:t>Gerente de Projeto (C); COO (I)</w:t>
+              <w:rPr>
+                <w:rFonts w:ascii="Calibri" w:hAnsi="Calibri"/>
+                <w:b w:val="0"/>
+                <w:i w:val="0"/>
+                <w:sz w:val="20"/>
+              </w:rPr>
+              <w:t>COO (I)</w:t>
             </w:r>
           </w:p>
         </w:tc>
@@ -2005,6 +2101,12 @@
               <w:spacing w:before="40" w:after="40"/>
             </w:pPr>
             <w:r>
+              <w:rPr>
+                <w:rFonts w:ascii="Calibri" w:hAnsi="Calibri"/>
+                <w:b w:val="0"/>
+                <w:i w:val="0"/>
+                <w:sz w:val="20"/>
+              </w:rPr>
               <w:t>COO</w:t>
             </w:r>
           </w:p>
@@ -2051,7 +2153,13 @@
               <w:spacing w:before="40" w:after="40"/>
             </w:pPr>
             <w:r>
-              <w:t>RH / Capacitação (C); Sponsor / Portfólio (I)</w:t>
+              <w:rPr>
+                <w:rFonts w:ascii="Calibri" w:hAnsi="Calibri"/>
+                <w:b w:val="0"/>
+                <w:i w:val="0"/>
+                <w:sz w:val="20"/>
+              </w:rPr>
+              <w:t>COO (A)</w:t>
             </w:r>
           </w:p>
         </w:tc>
@@ -2109,7 +2217,13 @@
               <w:spacing w:before="40" w:after="40"/>
             </w:pPr>
             <w:r>
-              <w:t>Tech Lead</w:t>
+              <w:rPr>
+                <w:rFonts w:ascii="Calibri" w:hAnsi="Calibri"/>
+                <w:b w:val="0"/>
+                <w:i w:val="0"/>
+                <w:sz w:val="20"/>
+              </w:rPr>
+              <w:t>Time de Melhoria Contínua</w:t>
             </w:r>
           </w:p>
         </w:tc>
@@ -2153,7 +2267,13 @@
               <w:spacing w:before="40" w:after="40"/>
             </w:pPr>
             <w:r>
-              <w:t>SEPG (C) em decisões organizacionais; GQA (C)</w:t>
+              <w:rPr>
+                <w:rFonts w:ascii="Calibri" w:hAnsi="Calibri"/>
+                <w:b w:val="0"/>
+                <w:i w:val="0"/>
+                <w:sz w:val="20"/>
+              </w:rPr>
+              <w:t>COO (C); GQA (C)</w:t>
             </w:r>
           </w:p>
         </w:tc>
@@ -2213,7 +2333,13 @@
               <w:spacing w:before="40" w:after="40"/>
             </w:pPr>
             <w:r>
-              <w:t>Time de Melhoria Contínua / SEPG</w:t>
+              <w:rPr>
+                <w:rFonts w:ascii="Calibri" w:hAnsi="Calibri"/>
+                <w:b w:val="0"/>
+                <w:i w:val="0"/>
+                <w:sz w:val="20"/>
+              </w:rPr>
+              <w:t>COO</w:t>
             </w:r>
           </w:p>
         </w:tc>
@@ -2259,7 +2385,13 @@
               <w:spacing w:before="40" w:after="40"/>
             </w:pPr>
             <w:r>
-              <w:t>CEO (C); Sponsor / Portfólio (C)</w:t>
+              <w:rPr>
+                <w:rFonts w:ascii="Calibri" w:hAnsi="Calibri"/>
+                <w:b w:val="0"/>
+                <w:i w:val="0"/>
+                <w:sz w:val="20"/>
+              </w:rPr>
+              <w:t>GQA (C); COO (A)</w:t>
             </w:r>
           </w:p>
         </w:tc>
@@ -2317,7 +2449,13 @@
               <w:spacing w:before="40" w:after="40"/>
             </w:pPr>
             <w:r>
-              <w:t>Time de Melhoria Contínua / SEPG</w:t>
+              <w:rPr>
+                <w:rFonts w:ascii="Calibri" w:hAnsi="Calibri"/>
+                <w:b w:val="0"/>
+                <w:i w:val="0"/>
+                <w:sz w:val="20"/>
+              </w:rPr>
+              <w:t>CEO</w:t>
             </w:r>
           </w:p>
         </w:tc>
@@ -2361,7 +2499,13 @@
               <w:spacing w:before="40" w:after="40"/>
             </w:pPr>
             <w:r>
-              <w:t>CEO (C); Sponsor / Portfólio (C)</w:t>
+              <w:rPr>
+                <w:rFonts w:ascii="Calibri" w:hAnsi="Calibri"/>
+                <w:b w:val="0"/>
+                <w:i w:val="0"/>
+                <w:sz w:val="20"/>
+              </w:rPr>
+              <w:t>CEO (A)</w:t>
             </w:r>
           </w:p>
         </w:tc>
@@ -4009,13 +4153,7 @@
               <w:spacing w:before="40" w:after="40"/>
             </w:pPr>
             <w:r>
-              <w:rPr>
-                <w:rFonts w:ascii="Calibri" w:hAnsi="Calibri"/>
-                <w:b w:val="0"/>
-                <w:i w:val="0"/>
-                <w:sz w:val="20"/>
-              </w:rPr>
-              <w:t>Renan Kioshi, Raony Chagas, Fernando Oliveira, Henry Komatsu</w:t>
+              <w:t>Renan Kioshi, Raony Chagas</w:t>
             </w:r>
           </w:p>
         </w:tc>
@@ -4090,13 +4228,7 @@
               <w:spacing w:before="40" w:after="40"/>
             </w:pPr>
             <w:r>
-              <w:rPr>
-                <w:rFonts w:ascii="Calibri" w:hAnsi="Calibri"/>
-                <w:b w:val="0"/>
-                <w:i w:val="0"/>
-                <w:sz w:val="20"/>
-              </w:rPr>
-              <w:t>Caroline Jenifer (Carol), Jonatan Silva, Letícia Moraes</w:t>
+              <w:t>Caroline Jenifer (Carol)</w:t>
             </w:r>
           </w:p>
         </w:tc>
@@ -4172,13 +4304,7 @@
               <w:spacing w:before="40" w:after="40"/>
             </w:pPr>
             <w:r>
-              <w:rPr>
-                <w:rFonts w:ascii="Calibri" w:hAnsi="Calibri"/>
-                <w:b w:val="0"/>
-                <w:i w:val="0"/>
-                <w:sz w:val="20"/>
-              </w:rPr>
-              <w:t>Rafael Cunha</w:t>
+              <w:t>Flávio Fernandes</w:t>
             </w:r>
           </w:p>
         </w:tc>
@@ -4253,13 +4379,7 @@
               <w:spacing w:before="40" w:after="40"/>
             </w:pPr>
             <w:r>
-              <w:rPr>
-                <w:rFonts w:ascii="Calibri" w:hAnsi="Calibri"/>
-                <w:b w:val="0"/>
-                <w:i w:val="0"/>
-                <w:sz w:val="20"/>
-              </w:rPr>
-              <w:t>Mariana Teixeira</w:t>
+              <w:t>Cézar (Velázquez)</w:t>
             </w:r>
           </w:p>
         </w:tc>
@@ -4335,13 +4455,7 @@
               <w:spacing w:before="40" w:after="40"/>
             </w:pPr>
             <w:r>
-              <w:rPr>
-                <w:rFonts w:ascii="Calibri" w:hAnsi="Calibri"/>
-                <w:b w:val="0"/>
-                <w:i w:val="0"/>
-                <w:sz w:val="20"/>
-              </w:rPr>
-              <w:t>Flávio Fernandes</w:t>
+              <w:t>Silvio Baroni</w:t>
             </w:r>
           </w:p>
         </w:tc>
@@ -4416,13 +4530,7 @@
               <w:spacing w:before="40" w:after="40"/>
             </w:pPr>
             <w:r>
-              <w:rPr>
-                <w:rFonts w:ascii="Calibri" w:hAnsi="Calibri"/>
-                <w:b w:val="0"/>
-                <w:i w:val="0"/>
-                <w:sz w:val="20"/>
-              </w:rPr>
-              <w:t>Patricia Lima, Silvio Baroni (coordenação), Mariana Teixeira</w:t>
+              <w:t>Silvio Baroni</w:t>
             </w:r>
           </w:p>
         </w:tc>
@@ -4579,13 +4687,7 @@
               <w:spacing w:before="40" w:after="40"/>
             </w:pPr>
             <w:r>
-              <w:rPr>
-                <w:rFonts w:ascii="Calibri" w:hAnsi="Calibri"/>
-                <w:b w:val="0"/>
-                <w:i w:val="0"/>
-                <w:sz w:val="20"/>
-              </w:rPr>
-              <w:t>Thiago Nunes</w:t>
+              <w:t>Silvio Baroni</w:t>
             </w:r>
           </w:p>
         </w:tc>
@@ -4661,13 +4763,7 @@
               <w:spacing w:before="40" w:after="40"/>
             </w:pPr>
             <w:r>
-              <w:rPr>
-                <w:rFonts w:ascii="Calibri" w:hAnsi="Calibri"/>
-                <w:b w:val="0"/>
-                <w:i w:val="0"/>
-                <w:sz w:val="20"/>
-              </w:rPr>
-              <w:t>Guilherme Gomes, Camila Ferreira</w:t>
+              <w:t>Guilherme Gomes</w:t>
             </w:r>
           </w:p>
         </w:tc>
@@ -4824,13 +4920,7 @@
               <w:spacing w:before="40" w:after="40"/>
             </w:pPr>
             <w:r>
-              <w:rPr>
-                <w:rFonts w:ascii="Calibri" w:hAnsi="Calibri"/>
-                <w:b w:val="0"/>
-                <w:i w:val="0"/>
-                <w:sz w:val="20"/>
-              </w:rPr>
-              <w:t>COO (Operações)</w:t>
+              <w:t>Wilson Yamada</w:t>
             </w:r>
           </w:p>
         </w:tc>
@@ -5676,7 +5766,7 @@
               <w:spacing w:before="40" w:after="40"/>
             </w:pPr>
             <w:r>
-              <w:t>Atualização da distribuição de responsáveis por processo (RACI) conforme proposta de papéis para entrevistas MPS-SW Nível C</w:t>
+              <w:t>Atualização dos titulares na Seção 5 (Papel × Titular × Evidência) para a equipe da proposta de papéis para entrevistas MPS-SW Nível C (equipe principal + apoio opcional); coluna de evidência mantida.</w:t>
             </w:r>
           </w:p>
         </w:tc>

</xml_diff>